<commit_message>
Updated with my initials
</commit_message>
<xml_diff>
--- a/Electrical/Level 3 - 2365/6 - Lesson/Writeups/Lesson6/Lesson #6.docx
+++ b/Electrical/Level 3 - 2365/6 - Lesson/Writeups/Lesson6/Lesson #6.docx
@@ -8,7 +8,7 @@
         <w:pStyle w:val="Title"/>
         <w:rPr/>
       </w:pPr>
-      <w:bookmarkStart w:colFirst="0" w:colLast="0" w:name="_90flx9jz2ld1" w:id="0"/>
+      <w:bookmarkStart w:colFirst="0" w:colLast="0" w:name="_25hpj5delsh2" w:id="0"/>
       <w:bookmarkEnd w:id="0"/>
       <w:r>
         <w:rPr>
@@ -29,7 +29,7 @@
     </w:p>
     <w:sdt>
       <w:sdtPr>
-        <w:id w:val="-129531106"/>
+        <w:id w:val="1678581186"/>
         <w:docPartObj>
           <w:docPartGallery w:val="Table of Contents"/>
           <w:docPartUnique w:val="1"/>
@@ -55,7 +55,7 @@
             <w:instrText xml:space="preserve"> TOC \h \u \z \t "Heading 1,1,Heading 2,2,Heading 3,3,Heading 4,4,Heading 5,5,Heading 6,6,"</w:instrText>
             <w:fldChar w:fldCharType="separate"/>
           </w:r>
-          <w:hyperlink w:anchor="_op4qme6doeba">
+          <w:hyperlink w:anchor="_x8ynr7uwzqab">
             <w:r>
               <w:rPr>
                 <w:rFonts w:ascii="Arial" w:cs="Arial" w:eastAsia="Arial" w:hAnsi="Arial"/>
@@ -114,7 +114,7 @@
         <w:pStyle w:val="Heading1"/>
         <w:rPr/>
       </w:pPr>
-      <w:bookmarkStart w:colFirst="0" w:colLast="0" w:name="_op4qme6doeba" w:id="1"/>
+      <w:bookmarkStart w:colFirst="0" w:colLast="0" w:name="_x8ynr7uwzqab" w:id="1"/>
       <w:bookmarkEnd w:id="1"/>
       <w:r>
         <w:rPr>
@@ -240,12 +240,12 @@
           <wp:inline distB="114300" distT="114300" distL="114300" distR="114300">
             <wp:extent cx="2357438" cy="2317616"/>
             <wp:effectExtent b="38100" l="38100" r="38100" t="38100"/>
-            <wp:docPr id="3" name="image3.png"/>
+            <wp:docPr id="3" name="image7.png"/>
             <a:graphic>
               <a:graphicData uri="http://schemas.openxmlformats.org/drawingml/2006/picture">
                 <pic:pic>
                   <pic:nvPicPr>
-                    <pic:cNvPr id="0" name="image3.png"/>
+                    <pic:cNvPr id="0" name="image7.png"/>
                     <pic:cNvPicPr preferRelativeResize="0"/>
                   </pic:nvPicPr>
                   <pic:blipFill>
@@ -319,12 +319,12 @@
           <wp:inline distB="114300" distT="114300" distL="114300" distR="114300">
             <wp:extent cx="3981450" cy="971550"/>
             <wp:effectExtent b="50800" l="50800" r="50800" t="50800"/>
-            <wp:docPr id="4" name="image2.png"/>
+            <wp:docPr id="5" name="image1.png"/>
             <a:graphic>
               <a:graphicData uri="http://schemas.openxmlformats.org/drawingml/2006/picture">
                 <pic:pic>
                   <pic:nvPicPr>
-                    <pic:cNvPr id="0" name="image2.png"/>
+                    <pic:cNvPr id="0" name="image1.png"/>
                     <pic:cNvPicPr preferRelativeResize="0"/>
                   </pic:nvPicPr>
                   <pic:blipFill>
@@ -461,7 +461,7 @@
           <wp:inline distB="114300" distT="114300" distL="114300" distR="114300">
             <wp:extent cx="1819275" cy="723900"/>
             <wp:effectExtent b="25400" l="25400" r="25400" t="25400"/>
-            <wp:docPr id="2" name="image4.png"/>
+            <wp:docPr id="4" name="image4.png"/>
             <a:graphic>
               <a:graphicData uri="http://schemas.openxmlformats.org/drawingml/2006/picture">
                 <pic:pic>
@@ -531,12 +531,12 @@
           <wp:inline distB="114300" distT="114300" distL="114300" distR="114300">
             <wp:extent cx="1390650" cy="1504950"/>
             <wp:effectExtent b="25400" l="25400" r="25400" t="25400"/>
-            <wp:docPr id="5" name="image1.png"/>
+            <wp:docPr id="7" name="image3.png"/>
             <a:graphic>
               <a:graphicData uri="http://schemas.openxmlformats.org/drawingml/2006/picture">
                 <pic:pic>
                   <pic:nvPicPr>
-                    <pic:cNvPr id="0" name="image1.png"/>
+                    <pic:cNvPr id="0" name="image3.png"/>
                     <pic:cNvPicPr preferRelativeResize="0"/>
                   </pic:nvPicPr>
                   <pic:blipFill>
@@ -602,7 +602,7 @@
           <wp:inline distB="114300" distT="114300" distL="114300" distR="114300">
             <wp:extent cx="3014663" cy="2915821"/>
             <wp:effectExtent b="25400" l="25400" r="25400" t="25400"/>
-            <wp:docPr id="1" name="image6.png"/>
+            <wp:docPr id="6" name="image6.png"/>
             <a:graphic>
               <a:graphicData uri="http://schemas.openxmlformats.org/drawingml/2006/picture">
                 <pic:pic>
@@ -778,12 +778,12 @@
           <wp:inline distB="114300" distT="114300" distL="114300" distR="114300">
             <wp:extent cx="3128963" cy="3163473"/>
             <wp:effectExtent b="25400" l="25400" r="25400" t="25400"/>
-            <wp:docPr id="6" name="image7.png"/>
+            <wp:docPr id="2" name="image5.png"/>
             <a:graphic>
               <a:graphicData uri="http://schemas.openxmlformats.org/drawingml/2006/picture">
                 <pic:pic>
                   <pic:nvPicPr>
-                    <pic:cNvPr id="0" name="image7.png"/>
+                    <pic:cNvPr id="0" name="image5.png"/>
                     <pic:cNvPicPr preferRelativeResize="0"/>
                   </pic:nvPicPr>
                   <pic:blipFill>
@@ -906,12 +906,12 @@
           <wp:inline distB="114300" distT="114300" distL="114300" distR="114300">
             <wp:extent cx="1257300" cy="781050"/>
             <wp:effectExtent b="25400" l="25400" r="25400" t="25400"/>
-            <wp:docPr id="7" name="image5.png"/>
+            <wp:docPr id="1" name="image2.png"/>
             <a:graphic>
               <a:graphicData uri="http://schemas.openxmlformats.org/drawingml/2006/picture">
                 <pic:pic>
                   <pic:nvPicPr>
-                    <pic:cNvPr id="0" name="image5.png"/>
+                    <pic:cNvPr id="0" name="image2.png"/>
                     <pic:cNvPicPr preferRelativeResize="0"/>
                   </pic:nvPicPr>
                   <pic:blipFill>
@@ -1052,6 +1052,17 @@
         <w:rtl w:val="0"/>
       </w:rPr>
       <w:t xml:space="preserve">Class date: 14/12/2025</w:t>
+    </w:r>
+  </w:p>
+  <w:p>
+    <w:pPr>
+      <w:rPr/>
+    </w:pPr>
+    <w:r>
+      <w:rPr>
+        <w:rtl w:val="0"/>
+      </w:rPr>
+      <w:t xml:space="preserve">IWA</w:t>
     </w:r>
   </w:p>
 </w:hdr>

</xml_diff>